<commit_message>
Fix HANA data-width bug (Customers.stateCode 10->100) + add live deploy URL to report
- HANA rejected stateCode values up to 28 chars ('North East Lincolnshire') with
  error 274 while SQLite silently accepted them (String(10)). Widen to String(100).
- App now deployed and live on Cloud Foundry; report updated with the URL and the
  environment-parity hurdle write-up.

Co-Authored-By: Claude Opus 4.8 <noreply@anthropic.com>
</commit_message>
<xml_diff>
--- a/Endterm_Report_Team4.docx
+++ b/Endterm_Report_Team4.docx
@@ -157,7 +157,7 @@
           </w:tcPr>
           <w:p>
             <w:r>
-              <w:t>[insert approuter URL once the shared HANA is started and cf deploy completes]</w:t>
+              <w:t>https://btplearning-btpailearning-student5-retail-analytics.cfapps.us10.hana.ondemand.com</w:t>
             </w:r>
           </w:p>
         </w:tc>
@@ -1207,7 +1207,7 @@
         <w:pStyle w:val="ListBullet"/>
       </w:pPr>
       <w:r>
-        <w:t>Deployment surfaced the SQLite→HANA gap and UI-serving. We validated HANA compilation with cds build --production, packaged an MTA (HANA + XSUAA + approuter), and — rather than adopt Work Zone — bundled the UI5 apps into the approuter as static resources with OData paths routed to the CAP backend. (At submission the deploy is complete except for the shared course HANA Cloud instance being started by staff.)</w:t>
+        <w:t>Deployment surfaced the SQLite→HANA gap and UI-serving. We validated HANA compilation with cds build --production, packaged an MTA (HANA + XSUAA + approuter), and — rather than adopt Work Zone — bundled the UI5 apps into the approuter as static resources with OData paths routed to the CAP backend. A concrete environment-parity bug appeared only on HANA: the Customers.stateCode column was String(10), but the source data holds full region names up to 28 characters (e.g. 'North East Lincolnshire'); SQLite silently accepts this while HANA rejects it (error 274, 'inserted value too large'). Widening the column fixed the data load. The application is deployed and live on Cloud Foundry.</w:t>
       </w:r>
     </w:p>
     <w:p>

</xml_diff>